<commit_message>
Align deliverables with public Cloudflare deployment
</commit_message>
<xml_diff>
--- a/deliverables/ThreadCare_Technical_Brief_Wang_Yuyang.docx
+++ b/deliverables/ThreadCare_Technical_Brief_Wang_Yuyang.docx
@@ -354,20 +354,18 @@
         <w:rPr>
           <w:rFonts w:hint="eastAsia"/>
         </w:rPr>
-        <w:t xml:space="preserve">The system provides a page where clinician can </w:t>
+        <w:t>The system provides a page where the clinician can enter consultation outcomes and medication instructions, then simultaneously add them to the longitudinal timeline and send them to the patient.</w:t>
       </w:r>
       <w:r>
         <w:rPr>
           <w:rFonts w:hint="eastAsia" w:eastAsia="宋体"/>
           <w:lang w:val="en-US" w:eastAsia="zh-CN"/>
         </w:rPr>
-        <w:t>enter</w:t>
       </w:r>
       <w:r>
         <w:rPr>
           <w:rFonts w:hint="eastAsia"/>
         </w:rPr>
-        <w:t xml:space="preserve"> consultation outcomes and medication instructions, then simultaneously add them to the longitudinal timeline and send them to the patient.</w:t>
       </w:r>
     </w:p>
     <w:p>
@@ -424,7 +422,7 @@
           <w:sz w:val="18"/>
           <w:lang w:val="en-US" w:eastAsia="zh-CN"/>
         </w:rPr>
-        <w:t>After consultation, patients will be provided a form for rating and commenting. Thus the care team can get some feedback for further improvement.</w:t>
+        <w:t>After a consultation, patients receive a rating and comment form, giving the care team feedback for further improvement.</w:t>
       </w:r>
     </w:p>
     <w:p>
@@ -564,7 +562,7 @@
           <w:color w:val="auto"/>
           <w:sz w:val="16"/>
         </w:rPr>
-        <w:t>Figure 1. Browser clients share one server-enforced, clinic-scoped record; LLM providers never receive unredacted submitted text.</w:t>
+        <w:t>Figure 1. Public HTTPS clients share one Worker-enforced, clinic-scoped D1 record; LLM providers never receive unredacted submitted text.</w:t>
       </w:r>
     </w:p>
     <w:p>
@@ -591,7 +589,7 @@
           <w:color w:val="2F75B5"/>
           <w:sz w:val="18"/>
         </w:rPr>
-        <w:t xml:space="preserve">Request path. </w:t>
+        <w:t xml:space="preserve">Public request path. </w:t>
       </w:r>
       <w:r>
         <w:rPr>
@@ -601,7 +599,7 @@
           <w:color w:val="000000"/>
           <w:sz w:val="18"/>
         </w:rPr>
-        <w:t>Authenticated sessions are checked by server middleware before the care-note service reads or mutates state. Names, phone numbers, and supported IC/ID patterns are redacted before downstream summarisation. Gemini is the default LLM adapter, with an optional OpenAI-compatible fallback and deterministic fallbacks for temporary provider failure.</w:t>
+        <w:t>Role-scoped browsers connect over HTTPS to a Cloudflare Worker. The Worker verifies the session, applies RBAC, and reads or mutates the shared synthetic clinic state in Cloudflare D1. Names, phone numbers, and supported IC/ID patterns are redacted before downstream summarisation. Gemini is the default LLM adapter, with an optional OpenAI-compatible fallback and deterministic fallbacks for temporary provider failure. Live demo: https://threadcare-wang-yuyang.wang-yuyang.workers.dev.</w:t>
       </w:r>
     </w:p>
     <w:p>
@@ -1618,7 +1616,7 @@
           <w:sz w:val="18"/>
           <w:szCs w:val="18"/>
         </w:rPr>
-        <w:t xml:space="preserve">Hard constraint  </w:t>
+        <w:t xml:space="preserve">Hard constraint. </w:t>
       </w:r>
       <w:r>
         <w:rPr>
@@ -1850,7 +1848,7 @@
                 <w:color w:val="000000"/>
                 <w:sz w:val="17"/>
               </w:rPr>
-              <w:t>Synthetic data only; secrets excluded from Git</w:t>
+              <w:t>Synthetic-only public demo; API keys stored as Worker secrets and excluded from Git</w:t>
             </w:r>
           </w:p>
           <w:p>
@@ -2119,7 +2117,7 @@
           <w:color w:val="000000"/>
           <w:sz w:val="19"/>
         </w:rPr>
-        <w:t>Measurement used 20 warm-up iterations followed by 200 sequential localhost samples of the authenticated Care Note and conversation-loading path. This is a reproducible prototype benchmark, not a production multi-region load test.</w:t>
+        <w:t>Measurement used 20 warm-up iterations followed by 200 sequential local samples of the authenticated Care Note and conversation-loading path before public deployment. The Cloudflare endpoint was separately smoke-tested for HTTPS, Gemini configuration, clinician login, and shared patient retrieval; no public-network P95 is claimed.</w:t>
       </w:r>
     </w:p>
     <w:p>
@@ -2497,7 +2495,7 @@
                 <w:color w:val="000000"/>
                 <w:sz w:val="16"/>
               </w:rPr>
-              <w:t>Local JSON logical store with complete relations and audit/version behavior.</w:t>
+              <w:t>Cloudflare D1 persists one clinic-scoped JSON state snapshot for the public cross-device demo; local development uses an ignored JSON file.</w:t>
             </w:r>
           </w:p>
         </w:tc>
@@ -2536,7 +2534,7 @@
                 <w:color w:val="000000"/>
                 <w:sz w:val="16"/>
               </w:rPr>
-              <w:t>Production needs a transactional encrypted database, migrations, backups, and tested recovery.</w:t>
+              <w:t>Production needs a normalized transactional schema, encryption controls, migrations, backups, recovery, and concurrency testing.</w:t>
             </w:r>
           </w:p>
         </w:tc>

</xml_diff>

<commit_message>
Rebase technical brief on author draft
</commit_message>
<xml_diff>
--- a/deliverables/ThreadCare_Technical_Brief_Wang_Yuyang.docx
+++ b/deliverables/ThreadCare_Technical_Brief_Wang_Yuyang.docx
@@ -354,18 +354,20 @@
         <w:rPr>
           <w:rFonts w:hint="eastAsia"/>
         </w:rPr>
-        <w:t>The system provides a page where the clinician can enter consultation outcomes and medication instructions, then simultaneously add them to the longitudinal timeline and send them to the patient.</w:t>
+        <w:t xml:space="preserve">The system provides a page where clinician can </w:t>
       </w:r>
       <w:r>
         <w:rPr>
           <w:rFonts w:hint="eastAsia" w:eastAsia="宋体"/>
           <w:lang w:val="en-US" w:eastAsia="zh-CN"/>
         </w:rPr>
+        <w:t>enter</w:t>
       </w:r>
       <w:r>
         <w:rPr>
           <w:rFonts w:hint="eastAsia"/>
         </w:rPr>
+        <w:t xml:space="preserve"> consultation outcomes and medication instructions, then simultaneously add them to the longitudinal timeline and send them to the patient.</w:t>
       </w:r>
     </w:p>
     <w:p>
@@ -422,7 +424,7 @@
           <w:sz w:val="18"/>
           <w:lang w:val="en-US" w:eastAsia="zh-CN"/>
         </w:rPr>
-        <w:t>After a consultation, patients receive a rating and comment form, giving the care team feedback for further improvement.</w:t>
+        <w:t>After consultation, patients will be provided a form for rating and commenting. Thus the care team can get some feedback for further improvement.</w:t>
       </w:r>
     </w:p>
     <w:p>
@@ -1616,7 +1618,7 @@
           <w:sz w:val="18"/>
           <w:szCs w:val="18"/>
         </w:rPr>
-        <w:t xml:space="preserve">Hard constraint. </w:t>
+        <w:t xml:space="preserve">Hard constraint  </w:t>
       </w:r>
       <w:r>
         <w:rPr>

</xml_diff>

<commit_message>
Normalize technical brief typography
</commit_message>
<xml_diff>
--- a/deliverables/ThreadCare_Technical_Brief_Wang_Yuyang.docx
+++ b/deliverables/ThreadCare_Technical_Brief_Wang_Yuyang.docx
@@ -21,7 +21,7 @@
       </w:pPr>
       <w:r>
         <w:rPr>
-          <w:rFonts w:ascii="Calibri" w:hAnsi="Calibri"/>
+          <w:rFonts w:ascii="Calibri" w:hAnsi="Calibri" w:eastAsia="Calibri" w:cs="Calibri"/>
           <w:b/>
           <w:i w:val="0"/>
           <w:color w:val="1F4E79"/>
@@ -49,7 +49,7 @@
       </w:pPr>
       <w:r>
         <w:rPr>
-          <w:rFonts w:ascii="Calibri" w:hAnsi="Calibri"/>
+          <w:rFonts w:ascii="Calibri" w:hAnsi="Calibri" w:eastAsia="Calibri" w:cs="Calibri"/>
           <w:b w:val="0"/>
           <w:i w:val="0"/>
           <w:color w:val="2F75B5"/>
@@ -76,7 +76,7 @@
       </w:pPr>
       <w:r>
         <w:rPr>
-          <w:rFonts w:ascii="Calibri" w:hAnsi="Calibri"/>
+          <w:rFonts w:ascii="Calibri" w:hAnsi="Calibri" w:eastAsia="Calibri" w:cs="Calibri"/>
           <w:b w:val="0"/>
           <w:i w:val="0"/>
           <w:color w:val="333333"/>
@@ -142,7 +142,7 @@
             </w:pPr>
             <w:r>
               <w:rPr>
-                <w:rFonts w:ascii="Calibri" w:hAnsi="Calibri"/>
+                <w:rFonts w:ascii="Calibri" w:hAnsi="Calibri" w:eastAsia="Calibri" w:cs="Calibri"/>
                 <w:b/>
                 <w:i w:val="0"/>
                 <w:color w:val="2F75B5"/>
@@ -152,7 +152,7 @@
             </w:r>
             <w:r>
               <w:rPr>
-                <w:rFonts w:hint="eastAsia" w:eastAsia="宋体"/>
+                <w:rFonts w:eastAsia="Calibri" w:ascii="Calibri" w:hAnsi="Calibri" w:cs="Calibri"/>
                 <w:b w:val="0"/>
                 <w:bCs/>
                 <w:i w:val="0"/>
@@ -164,7 +164,7 @@
             </w:r>
             <w:r>
               <w:rPr>
-                <w:rFonts w:ascii="Calibri" w:hAnsi="Calibri"/>
+                <w:rFonts w:ascii="Calibri" w:hAnsi="Calibri" w:eastAsia="Calibri" w:cs="Calibri"/>
                 <w:b w:val="0"/>
                 <w:i w:val="0"/>
                 <w:color w:val="000000"/>
@@ -194,6 +194,9 @@
         <w:textAlignment w:val="auto"/>
       </w:pPr>
       <w:r>
+        <w:rPr>
+          <w:rFonts w:ascii="Calibri" w:hAnsi="Calibri" w:eastAsia="Calibri" w:cs="Calibri"/>
+        </w:rPr>
         <w:t>1. Problem, users, and design principles</w:t>
       </w:r>
     </w:p>
@@ -215,7 +218,7 @@
       </w:pPr>
       <w:r>
         <w:rPr>
-          <w:rFonts w:ascii="Calibri" w:hAnsi="Calibri"/>
+          <w:rFonts w:ascii="Calibri" w:hAnsi="Calibri" w:eastAsia="Calibri" w:cs="Calibri"/>
           <w:b/>
           <w:i w:val="0"/>
           <w:color w:val="000000"/>
@@ -226,7 +229,7 @@
       </w:r>
       <w:r>
         <w:rPr>
-          <w:rFonts w:ascii="Calibri" w:hAnsi="Calibri"/>
+          <w:rFonts w:ascii="Calibri" w:hAnsi="Calibri" w:eastAsia="Calibri" w:cs="Calibri"/>
           <w:b/>
           <w:i w:val="0"/>
           <w:color w:val="000000"/>
@@ -236,7 +239,7 @@
       </w:r>
       <w:r>
         <w:rPr>
-          <w:rFonts w:ascii="Calibri" w:hAnsi="Calibri"/>
+          <w:rFonts w:ascii="Calibri" w:hAnsi="Calibri" w:eastAsia="Calibri" w:cs="Calibri"/>
           <w:b w:val="0"/>
           <w:i w:val="0"/>
           <w:color w:val="000000"/>
@@ -246,7 +249,7 @@
       </w:r>
       <w:r>
         <w:rPr>
-          <w:rFonts w:hint="eastAsia" w:eastAsia="宋体"/>
+          <w:rFonts w:eastAsia="Calibri" w:ascii="Calibri" w:hAnsi="Calibri" w:cs="Calibri"/>
           <w:b w:val="0"/>
           <w:i w:val="0"/>
           <w:color w:val="000000"/>
@@ -257,7 +260,7 @@
       </w:r>
       <w:r>
         <w:rPr>
-          <w:rFonts w:ascii="Calibri" w:hAnsi="Calibri"/>
+          <w:rFonts w:ascii="Calibri" w:hAnsi="Calibri" w:eastAsia="Calibri" w:cs="Calibri"/>
           <w:b w:val="0"/>
           <w:i w:val="0"/>
           <w:color w:val="000000"/>
@@ -285,7 +288,7 @@
       </w:pPr>
       <w:r>
         <w:rPr>
-          <w:rFonts w:ascii="Calibri" w:hAnsi="Calibri"/>
+          <w:rFonts w:ascii="Calibri" w:hAnsi="Calibri" w:eastAsia="Calibri" w:cs="Calibri"/>
           <w:b w:val="0"/>
           <w:i w:val="0"/>
           <w:color w:val="000000"/>
@@ -313,7 +316,7 @@
       </w:pPr>
       <w:r>
         <w:rPr>
-          <w:rFonts w:ascii="Calibri" w:hAnsi="Calibri"/>
+          <w:rFonts w:ascii="Calibri" w:hAnsi="Calibri" w:eastAsia="Calibri" w:cs="Calibri"/>
           <w:b w:val="0"/>
           <w:i w:val="0"/>
           <w:color w:val="000000"/>
@@ -323,7 +326,7 @@
       </w:r>
       <w:r>
         <w:rPr>
-          <w:rFonts w:hint="eastAsia" w:eastAsia="宋体"/>
+          <w:rFonts w:eastAsia="Calibri" w:ascii="Calibri" w:hAnsi="Calibri" w:cs="Calibri"/>
           <w:b w:val="0"/>
           <w:i w:val="0"/>
           <w:color w:val="000000"/>
@@ -352,20 +355,20 @@
       </w:pPr>
       <w:r>
         <w:rPr>
-          <w:rFonts w:hint="eastAsia"/>
+          <w:rFonts w:ascii="Calibri" w:hAnsi="Calibri" w:eastAsia="Calibri" w:cs="Calibri"/>
         </w:rPr>
         <w:t xml:space="preserve">The system provides a page where clinician can </w:t>
       </w:r>
       <w:r>
         <w:rPr>
-          <w:rFonts w:hint="eastAsia" w:eastAsia="宋体"/>
+          <w:rFonts w:eastAsia="Calibri" w:ascii="Calibri" w:hAnsi="Calibri" w:cs="Calibri"/>
           <w:lang w:val="en-US" w:eastAsia="zh-CN"/>
         </w:rPr>
         <w:t>enter</w:t>
       </w:r>
       <w:r>
         <w:rPr>
-          <w:rFonts w:hint="eastAsia"/>
+          <w:rFonts w:ascii="Calibri" w:hAnsi="Calibri" w:eastAsia="Calibri" w:cs="Calibri"/>
         </w:rPr>
         <w:t xml:space="preserve"> consultation outcomes and medication instructions, then simultaneously add them to the longitudinal timeline and send them to the patient.</w:t>
       </w:r>
@@ -389,7 +392,7 @@
       </w:pPr>
       <w:r>
         <w:rPr>
-          <w:rFonts w:ascii="Calibri" w:hAnsi="Calibri"/>
+          <w:rFonts w:ascii="Calibri" w:hAnsi="Calibri" w:eastAsia="Calibri" w:cs="Calibri"/>
           <w:b w:val="0"/>
           <w:i w:val="0"/>
           <w:color w:val="000000"/>
@@ -417,7 +420,7 @@
       </w:pPr>
       <w:r>
         <w:rPr>
-          <w:rFonts w:hint="eastAsia" w:eastAsia="宋体"/>
+          <w:rFonts w:eastAsia="Calibri" w:ascii="Calibri" w:hAnsi="Calibri" w:cs="Calibri"/>
           <w:b w:val="0"/>
           <w:i w:val="0"/>
           <w:color w:val="000000"/>
@@ -446,7 +449,7 @@
       </w:pPr>
       <w:r>
         <w:rPr>
-          <w:rFonts w:ascii="Calibri" w:hAnsi="Calibri"/>
+          <w:rFonts w:ascii="Calibri" w:hAnsi="Calibri" w:eastAsia="Calibri" w:cs="Calibri"/>
           <w:b w:val="0"/>
           <w:i w:val="0"/>
           <w:color w:val="000000"/>
@@ -473,6 +476,9 @@
         <w:textAlignment w:val="auto"/>
       </w:pPr>
       <w:r>
+        <w:rPr>
+          <w:rFonts w:ascii="Calibri" w:hAnsi="Calibri" w:eastAsia="Calibri" w:cs="Calibri"/>
+        </w:rPr>
         <w:t>2. Architecture</w:t>
       </w:r>
     </w:p>
@@ -557,7 +563,7 @@
       </w:pPr>
       <w:r>
         <w:rPr>
-          <w:rFonts w:ascii="Calibri" w:hAnsi="Calibri"/>
+          <w:rFonts w:ascii="Calibri" w:hAnsi="Calibri" w:eastAsia="Calibri" w:cs="Calibri"/>
           <w:b/>
           <w:bCs/>
           <w:i/>
@@ -585,7 +591,7 @@
       </w:pPr>
       <w:r>
         <w:rPr>
-          <w:rFonts w:ascii="Calibri" w:hAnsi="Calibri"/>
+          <w:rFonts w:ascii="Calibri" w:hAnsi="Calibri" w:eastAsia="Calibri" w:cs="Calibri"/>
           <w:b/>
           <w:i w:val="0"/>
           <w:color w:val="2F75B5"/>
@@ -595,7 +601,7 @@
       </w:r>
       <w:r>
         <w:rPr>
-          <w:rFonts w:ascii="Calibri" w:hAnsi="Calibri"/>
+          <w:rFonts w:ascii="Calibri" w:hAnsi="Calibri" w:eastAsia="Calibri" w:cs="Calibri"/>
           <w:b w:val="0"/>
           <w:i w:val="0"/>
           <w:color w:val="000000"/>
@@ -642,6 +648,9 @@
         <w:textAlignment w:val="auto"/>
       </w:pPr>
       <w:r>
+        <w:rPr>
+          <w:rFonts w:ascii="Calibri" w:hAnsi="Calibri" w:eastAsia="Calibri" w:cs="Calibri"/>
+        </w:rPr>
         <w:t>3. Data model: one record, preserved sources</w:t>
       </w:r>
     </w:p>
@@ -663,7 +672,7 @@
       </w:pPr>
       <w:r>
         <w:rPr>
-          <w:rFonts w:ascii="Calibri" w:hAnsi="Calibri"/>
+          <w:rFonts w:ascii="Calibri" w:hAnsi="Calibri" w:eastAsia="Calibri" w:cs="Calibri"/>
           <w:b/>
           <w:i w:val="0"/>
           <w:color w:val="000000"/>
@@ -673,7 +682,7 @@
       </w:r>
       <w:r>
         <w:rPr>
-          <w:rFonts w:ascii="Calibri" w:hAnsi="Calibri"/>
+          <w:rFonts w:ascii="Calibri" w:hAnsi="Calibri" w:eastAsia="Calibri" w:cs="Calibri"/>
           <w:b w:val="0"/>
           <w:i w:val="0"/>
           <w:color w:val="000000"/>
@@ -763,7 +772,7 @@
       </w:pPr>
       <w:r>
         <w:rPr>
-          <w:rFonts w:ascii="Calibri" w:hAnsi="Calibri"/>
+          <w:rFonts w:ascii="Calibri" w:hAnsi="Calibri" w:eastAsia="Calibri" w:cs="Calibri"/>
           <w:b/>
           <w:bCs/>
           <w:i/>
@@ -834,7 +843,7 @@
             </w:pPr>
             <w:r>
               <w:rPr>
-                <w:rFonts w:ascii="Calibri" w:hAnsi="Calibri"/>
+                <w:rFonts w:ascii="Calibri" w:hAnsi="Calibri" w:eastAsia="Calibri" w:cs="Calibri"/>
                 <w:b/>
                 <w:i w:val="0"/>
                 <w:color w:val="FFFFFF"/>
@@ -874,7 +883,7 @@
             </w:pPr>
             <w:r>
               <w:rPr>
-                <w:rFonts w:ascii="Calibri" w:hAnsi="Calibri"/>
+                <w:rFonts w:ascii="Calibri" w:hAnsi="Calibri" w:eastAsia="Calibri" w:cs="Calibri"/>
                 <w:b/>
                 <w:i w:val="0"/>
                 <w:color w:val="FFFFFF"/>
@@ -914,7 +923,7 @@
             </w:pPr>
             <w:r>
               <w:rPr>
-                <w:rFonts w:ascii="Calibri" w:hAnsi="Calibri"/>
+                <w:rFonts w:ascii="Calibri" w:hAnsi="Calibri" w:eastAsia="Calibri" w:cs="Calibri"/>
                 <w:b/>
                 <w:i w:val="0"/>
                 <w:color w:val="FFFFFF"/>
@@ -965,7 +974,7 @@
             </w:pPr>
             <w:r>
               <w:rPr>
-                <w:rFonts w:ascii="Calibri" w:hAnsi="Calibri"/>
+                <w:rFonts w:ascii="Calibri" w:hAnsi="Calibri" w:eastAsia="Calibri" w:cs="Calibri"/>
                 <w:b/>
                 <w:i w:val="0"/>
                 <w:color w:val="2F75B5"/>
@@ -1003,7 +1012,7 @@
             </w:pPr>
             <w:r>
               <w:rPr>
-                <w:rFonts w:ascii="Calibri" w:hAnsi="Calibri"/>
+                <w:rFonts w:ascii="Calibri" w:hAnsi="Calibri" w:eastAsia="Calibri" w:cs="Calibri"/>
                 <w:b w:val="0"/>
                 <w:i w:val="0"/>
                 <w:color w:val="000000"/>
@@ -1041,7 +1050,7 @@
             </w:pPr>
             <w:r>
               <w:rPr>
-                <w:rFonts w:ascii="Calibri" w:hAnsi="Calibri"/>
+                <w:rFonts w:ascii="Calibri" w:hAnsi="Calibri" w:eastAsia="Calibri" w:cs="Calibri"/>
                 <w:b w:val="0"/>
                 <w:i w:val="0"/>
                 <w:color w:val="000000"/>
@@ -1051,7 +1060,7 @@
             </w:r>
             <w:r>
               <w:rPr>
-                <w:rFonts w:hint="eastAsia" w:eastAsia="宋体"/>
+                <w:rFonts w:eastAsia="Calibri" w:ascii="Calibri" w:hAnsi="Calibri" w:cs="Calibri"/>
                 <w:b w:val="0"/>
                 <w:i w:val="0"/>
                 <w:color w:val="000000"/>
@@ -1062,7 +1071,7 @@
             </w:r>
             <w:r>
               <w:rPr>
-                <w:rFonts w:ascii="Calibri" w:hAnsi="Calibri"/>
+                <w:rFonts w:ascii="Calibri" w:hAnsi="Calibri" w:eastAsia="Calibri" w:cs="Calibri"/>
                 <w:b w:val="0"/>
                 <w:i w:val="0"/>
                 <w:color w:val="000000"/>
@@ -1114,7 +1123,7 @@
             </w:pPr>
             <w:r>
               <w:rPr>
-                <w:rFonts w:ascii="Calibri" w:hAnsi="Calibri"/>
+                <w:rFonts w:ascii="Calibri" w:hAnsi="Calibri" w:eastAsia="Calibri" w:cs="Calibri"/>
                 <w:b/>
                 <w:i w:val="0"/>
                 <w:color w:val="2F75B5"/>
@@ -1153,7 +1162,7 @@
             </w:pPr>
             <w:r>
               <w:rPr>
-                <w:rFonts w:ascii="Calibri" w:hAnsi="Calibri"/>
+                <w:rFonts w:ascii="Calibri" w:hAnsi="Calibri" w:eastAsia="Calibri" w:cs="Calibri"/>
                 <w:b w:val="0"/>
                 <w:i w:val="0"/>
                 <w:color w:val="000000"/>
@@ -1192,7 +1201,7 @@
             </w:pPr>
             <w:r>
               <w:rPr>
-                <w:rFonts w:ascii="Calibri" w:hAnsi="Calibri"/>
+                <w:rFonts w:ascii="Calibri" w:hAnsi="Calibri" w:eastAsia="Calibri" w:cs="Calibri"/>
                 <w:b w:val="0"/>
                 <w:i w:val="0"/>
                 <w:color w:val="000000"/>
@@ -1243,7 +1252,7 @@
             </w:pPr>
             <w:r>
               <w:rPr>
-                <w:rFonts w:ascii="Calibri" w:hAnsi="Calibri"/>
+                <w:rFonts w:ascii="Calibri" w:hAnsi="Calibri" w:eastAsia="Calibri" w:cs="Calibri"/>
                 <w:b/>
                 <w:i w:val="0"/>
                 <w:color w:val="2F75B5"/>
@@ -1281,7 +1290,7 @@
             </w:pPr>
             <w:r>
               <w:rPr>
-                <w:rFonts w:ascii="Calibri" w:hAnsi="Calibri"/>
+                <w:rFonts w:ascii="Calibri" w:hAnsi="Calibri" w:eastAsia="Calibri" w:cs="Calibri"/>
                 <w:b w:val="0"/>
                 <w:i w:val="0"/>
                 <w:color w:val="000000"/>
@@ -1319,7 +1328,7 @@
             </w:pPr>
             <w:r>
               <w:rPr>
-                <w:rFonts w:ascii="Calibri" w:hAnsi="Calibri"/>
+                <w:rFonts w:ascii="Calibri" w:hAnsi="Calibri" w:eastAsia="Calibri" w:cs="Calibri"/>
                 <w:b w:val="0"/>
                 <w:i w:val="0"/>
                 <w:color w:val="000000"/>
@@ -1371,7 +1380,7 @@
             </w:pPr>
             <w:r>
               <w:rPr>
-                <w:rFonts w:ascii="Calibri" w:hAnsi="Calibri"/>
+                <w:rFonts w:ascii="Calibri" w:hAnsi="Calibri" w:eastAsia="Calibri" w:cs="Calibri"/>
                 <w:b/>
                 <w:i w:val="0"/>
                 <w:color w:val="2F75B5"/>
@@ -1410,7 +1419,7 @@
             </w:pPr>
             <w:r>
               <w:rPr>
-                <w:rFonts w:ascii="Calibri" w:hAnsi="Calibri"/>
+                <w:rFonts w:ascii="Calibri" w:hAnsi="Calibri" w:eastAsia="Calibri" w:cs="Calibri"/>
                 <w:b w:val="0"/>
                 <w:i w:val="0"/>
                 <w:color w:val="000000"/>
@@ -1449,7 +1458,7 @@
             </w:pPr>
             <w:r>
               <w:rPr>
-                <w:rFonts w:ascii="Calibri" w:hAnsi="Calibri"/>
+                <w:rFonts w:ascii="Calibri" w:hAnsi="Calibri" w:eastAsia="Calibri" w:cs="Calibri"/>
                 <w:b w:val="0"/>
                 <w:i w:val="0"/>
                 <w:color w:val="000000"/>
@@ -1479,16 +1488,22 @@
         <w:textAlignment w:val="auto"/>
       </w:pPr>
       <w:r>
+        <w:rPr>
+          <w:rFonts w:ascii="Calibri" w:hAnsi="Calibri" w:eastAsia="Calibri" w:cs="Calibri"/>
+        </w:rPr>
         <w:t xml:space="preserve">4. </w:t>
       </w:r>
       <w:r>
         <w:rPr>
-          <w:rFonts w:hint="eastAsia" w:eastAsia="宋体"/>
+          <w:rFonts w:eastAsia="Calibri" w:ascii="Calibri" w:hAnsi="Calibri" w:cs="Calibri"/>
           <w:lang w:val="en-US" w:eastAsia="zh-CN"/>
         </w:rPr>
         <w:t>Self-</w:t>
       </w:r>
       <w:r>
+        <w:rPr>
+          <w:rFonts w:ascii="Calibri" w:hAnsi="Calibri" w:eastAsia="Calibri" w:cs="Calibri"/>
+        </w:rPr>
         <w:t>learning</w:t>
       </w:r>
     </w:p>
@@ -1518,7 +1533,7 @@
       </w:pPr>
       <w:r>
         <w:rPr>
-          <w:rFonts w:ascii="Calibri" w:hAnsi="Calibri"/>
+          <w:rFonts w:ascii="Calibri" w:hAnsi="Calibri" w:eastAsia="Calibri" w:cs="Calibri"/>
           <w:b/>
           <w:i w:val="0"/>
           <w:color w:val="2F75B5"/>
@@ -1529,7 +1544,7 @@
       </w:r>
       <w:r>
         <w:rPr>
-          <w:rFonts w:ascii="Calibri" w:hAnsi="Calibri"/>
+          <w:rFonts w:ascii="Calibri" w:hAnsi="Calibri" w:eastAsia="Calibri" w:cs="Calibri"/>
           <w:b w:val="0"/>
           <w:i w:val="0"/>
           <w:color w:val="000000"/>
@@ -1540,7 +1555,7 @@
       </w:r>
       <w:r>
         <w:rPr>
-          <w:rFonts w:hint="eastAsia" w:eastAsia="宋体"/>
+          <w:rFonts w:eastAsia="Calibri" w:ascii="Calibri" w:hAnsi="Calibri" w:cs="Calibri"/>
           <w:b w:val="0"/>
           <w:i w:val="0"/>
           <w:color w:val="000000"/>
@@ -1552,7 +1567,7 @@
       </w:r>
       <w:r>
         <w:rPr>
-          <w:rFonts w:ascii="Calibri" w:hAnsi="Calibri"/>
+          <w:rFonts w:ascii="Calibri" w:hAnsi="Calibri" w:eastAsia="Calibri" w:cs="Calibri"/>
           <w:b w:val="0"/>
           <w:i w:val="0"/>
           <w:color w:val="000000"/>
@@ -1563,7 +1578,7 @@
       </w:r>
       <w:r>
         <w:rPr>
-          <w:rFonts w:hint="eastAsia" w:eastAsia="宋体"/>
+          <w:rFonts w:eastAsia="Calibri" w:ascii="Calibri" w:hAnsi="Calibri" w:cs="Calibri"/>
           <w:b w:val="0"/>
           <w:i w:val="0"/>
           <w:color w:val="000000"/>
@@ -1575,7 +1590,7 @@
       </w:r>
       <w:r>
         <w:rPr>
-          <w:rFonts w:ascii="Calibri" w:hAnsi="Calibri"/>
+          <w:rFonts w:ascii="Calibri" w:hAnsi="Calibri" w:eastAsia="Calibri" w:cs="Calibri"/>
           <w:b w:val="0"/>
           <w:i w:val="0"/>
           <w:color w:val="000000"/>
@@ -1611,7 +1626,7 @@
       </w:pPr>
       <w:r>
         <w:rPr>
-          <w:rFonts w:ascii="Calibri" w:hAnsi="Calibri"/>
+          <w:rFonts w:ascii="Calibri" w:hAnsi="Calibri" w:eastAsia="Calibri" w:cs="Calibri"/>
           <w:b/>
           <w:i w:val="0"/>
           <w:color w:val="2F75B5"/>
@@ -1622,7 +1637,7 @@
       </w:r>
       <w:r>
         <w:rPr>
-          <w:rFonts w:ascii="Calibri" w:hAnsi="Calibri"/>
+          <w:rFonts w:ascii="Calibri" w:hAnsi="Calibri" w:eastAsia="Calibri" w:cs="Calibri"/>
           <w:b w:val="0"/>
           <w:i w:val="0"/>
           <w:color w:val="000000"/>
@@ -1670,6 +1685,9 @@
         <w:textAlignment w:val="auto"/>
       </w:pPr>
       <w:r>
+        <w:rPr>
+          <w:rFonts w:ascii="Calibri" w:hAnsi="Calibri" w:eastAsia="Calibri" w:cs="Calibri"/>
+        </w:rPr>
         <w:t>5. Safety, permissions, and evidence</w:t>
       </w:r>
     </w:p>
@@ -1732,7 +1750,7 @@
             </w:pPr>
             <w:r>
               <w:rPr>
-                <w:rFonts w:ascii="Calibri" w:hAnsi="Calibri"/>
+                <w:rFonts w:ascii="Calibri" w:hAnsi="Calibri" w:eastAsia="Calibri" w:cs="Calibri"/>
                 <w:b/>
                 <w:i w:val="0"/>
                 <w:color w:val="2F75B5"/>
@@ -1760,7 +1778,7 @@
             </w:pPr>
             <w:r>
               <w:rPr>
-                <w:rFonts w:ascii="Calibri" w:hAnsi="Calibri"/>
+                <w:rFonts w:ascii="Calibri" w:hAnsi="Calibri" w:eastAsia="Calibri" w:cs="Calibri"/>
                 <w:b w:val="0"/>
                 <w:i w:val="0"/>
                 <w:color w:val="000000"/>
@@ -1788,7 +1806,7 @@
             </w:pPr>
             <w:r>
               <w:rPr>
-                <w:rFonts w:ascii="Calibri" w:hAnsi="Calibri"/>
+                <w:rFonts w:ascii="Calibri" w:hAnsi="Calibri" w:eastAsia="Calibri" w:cs="Calibri"/>
                 <w:b w:val="0"/>
                 <w:i w:val="0"/>
                 <w:color w:val="000000"/>
@@ -1816,7 +1834,7 @@
             </w:pPr>
             <w:r>
               <w:rPr>
-                <w:rFonts w:ascii="Calibri" w:hAnsi="Calibri"/>
+                <w:rFonts w:ascii="Calibri" w:hAnsi="Calibri" w:eastAsia="Calibri" w:cs="Calibri"/>
                 <w:b w:val="0"/>
                 <w:i w:val="0"/>
                 <w:color w:val="000000"/>
@@ -1844,7 +1862,7 @@
             </w:pPr>
             <w:r>
               <w:rPr>
-                <w:rFonts w:ascii="Calibri" w:hAnsi="Calibri"/>
+                <w:rFonts w:ascii="Calibri" w:hAnsi="Calibri" w:eastAsia="Calibri" w:cs="Calibri"/>
                 <w:b w:val="0"/>
                 <w:i w:val="0"/>
                 <w:color w:val="000000"/>
@@ -1872,7 +1890,7 @@
             </w:pPr>
             <w:r>
               <w:rPr>
-                <w:rFonts w:ascii="Calibri" w:hAnsi="Calibri"/>
+                <w:rFonts w:ascii="Calibri" w:hAnsi="Calibri" w:eastAsia="Calibri" w:cs="Calibri"/>
                 <w:b w:val="0"/>
                 <w:i w:val="0"/>
                 <w:color w:val="000000"/>
@@ -1912,7 +1930,7 @@
             </w:pPr>
             <w:r>
               <w:rPr>
-                <w:rFonts w:ascii="Calibri" w:hAnsi="Calibri"/>
+                <w:rFonts w:ascii="Calibri" w:hAnsi="Calibri" w:eastAsia="Calibri" w:cs="Calibri"/>
                 <w:b/>
                 <w:i w:val="0"/>
                 <w:color w:val="2F75B5"/>
@@ -1940,7 +1958,7 @@
             </w:pPr>
             <w:r>
               <w:rPr>
-                <w:rFonts w:ascii="Calibri" w:hAnsi="Calibri"/>
+                <w:rFonts w:ascii="Calibri" w:hAnsi="Calibri" w:eastAsia="Calibri" w:cs="Calibri"/>
                 <w:b w:val="0"/>
                 <w:i w:val="0"/>
                 <w:color w:val="000000"/>
@@ -1968,7 +1986,7 @@
             </w:pPr>
             <w:r>
               <w:rPr>
-                <w:rFonts w:ascii="Calibri" w:hAnsi="Calibri"/>
+                <w:rFonts w:ascii="Calibri" w:hAnsi="Calibri" w:eastAsia="Calibri" w:cs="Calibri"/>
                 <w:b w:val="0"/>
                 <w:i w:val="0"/>
                 <w:color w:val="000000"/>
@@ -1996,7 +2014,7 @@
             </w:pPr>
             <w:r>
               <w:rPr>
-                <w:rFonts w:ascii="Calibri" w:hAnsi="Calibri"/>
+                <w:rFonts w:ascii="Calibri" w:hAnsi="Calibri" w:eastAsia="Calibri" w:cs="Calibri"/>
                 <w:b w:val="0"/>
                 <w:i w:val="0"/>
                 <w:color w:val="000000"/>
@@ -2024,7 +2042,7 @@
             </w:pPr>
             <w:r>
               <w:rPr>
-                <w:rFonts w:ascii="Calibri" w:hAnsi="Calibri"/>
+                <w:rFonts w:ascii="Calibri" w:hAnsi="Calibri" w:eastAsia="Calibri" w:cs="Calibri"/>
                 <w:b w:val="0"/>
                 <w:i w:val="0"/>
                 <w:color w:val="000000"/>
@@ -2052,7 +2070,7 @@
             </w:pPr>
             <w:r>
               <w:rPr>
-                <w:rFonts w:ascii="Calibri" w:hAnsi="Calibri"/>
+                <w:rFonts w:ascii="Calibri" w:hAnsi="Calibri" w:eastAsia="Calibri" w:cs="Calibri"/>
                 <w:b w:val="0"/>
                 <w:i w:val="0"/>
                 <w:color w:val="000000"/>
@@ -2082,6 +2100,9 @@
         <w:textAlignment w:val="auto"/>
       </w:pPr>
       <w:r>
+        <w:rPr>
+          <w:rFonts w:ascii="Calibri" w:hAnsi="Calibri" w:eastAsia="Calibri" w:cs="Calibri"/>
+        </w:rPr>
         <w:t>Warm-path latency</w:t>
       </w:r>
     </w:p>
@@ -2103,7 +2124,7 @@
       </w:pPr>
       <w:r>
         <w:rPr>
-          <w:rFonts w:ascii="Calibri" w:hAnsi="Calibri"/>
+          <w:rFonts w:ascii="Calibri" w:hAnsi="Calibri" w:eastAsia="Calibri" w:cs="Calibri"/>
           <w:b/>
           <w:i w:val="0"/>
           <w:color w:val="2F75B5"/>
@@ -2113,7 +2134,7 @@
       </w:r>
       <w:r>
         <w:rPr>
-          <w:rFonts w:ascii="Calibri" w:hAnsi="Calibri"/>
+          <w:rFonts w:ascii="Calibri" w:hAnsi="Calibri" w:eastAsia="Calibri" w:cs="Calibri"/>
           <w:b w:val="0"/>
           <w:i w:val="0"/>
           <w:color w:val="000000"/>
@@ -2140,6 +2161,9 @@
         <w:textAlignment w:val="auto"/>
       </w:pPr>
       <w:r>
+        <w:rPr>
+          <w:rFonts w:ascii="Calibri" w:hAnsi="Calibri" w:eastAsia="Calibri" w:cs="Calibri"/>
+        </w:rPr>
         <w:t>6. Assumptions and deliberate scope</w:t>
       </w:r>
     </w:p>
@@ -2195,7 +2219,7 @@
             </w:pPr>
             <w:r>
               <w:rPr>
-                <w:rFonts w:ascii="Calibri" w:hAnsi="Calibri"/>
+                <w:rFonts w:ascii="Calibri" w:hAnsi="Calibri" w:eastAsia="Calibri" w:cs="Calibri"/>
                 <w:b/>
                 <w:i w:val="0"/>
                 <w:color w:val="FFFFFF"/>
@@ -2234,7 +2258,7 @@
             </w:pPr>
             <w:r>
               <w:rPr>
-                <w:rFonts w:ascii="Calibri" w:hAnsi="Calibri"/>
+                <w:rFonts w:ascii="Calibri" w:hAnsi="Calibri" w:eastAsia="Calibri" w:cs="Calibri"/>
                 <w:b/>
                 <w:i w:val="0"/>
                 <w:color w:val="FFFFFF"/>
@@ -2273,7 +2297,7 @@
             </w:pPr>
             <w:r>
               <w:rPr>
-                <w:rFonts w:ascii="Calibri" w:hAnsi="Calibri"/>
+                <w:rFonts w:ascii="Calibri" w:hAnsi="Calibri" w:eastAsia="Calibri" w:cs="Calibri"/>
                 <w:b/>
                 <w:i w:val="0"/>
                 <w:color w:val="FFFFFF"/>
@@ -2324,7 +2348,7 @@
             </w:pPr>
             <w:r>
               <w:rPr>
-                <w:rFonts w:ascii="Calibri" w:hAnsi="Calibri"/>
+                <w:rFonts w:ascii="Calibri" w:hAnsi="Calibri" w:eastAsia="Calibri" w:cs="Calibri"/>
                 <w:b/>
                 <w:i w:val="0"/>
                 <w:color w:val="2F75B5"/>
@@ -2362,7 +2386,7 @@
             </w:pPr>
             <w:r>
               <w:rPr>
-                <w:rFonts w:ascii="Calibri" w:hAnsi="Calibri"/>
+                <w:rFonts w:ascii="Calibri" w:hAnsi="Calibri" w:eastAsia="Calibri" w:cs="Calibri"/>
                 <w:b w:val="0"/>
                 <w:i w:val="0"/>
                 <w:color w:val="000000"/>
@@ -2400,7 +2424,7 @@
             </w:pPr>
             <w:r>
               <w:rPr>
-                <w:rFonts w:ascii="Calibri" w:hAnsi="Calibri"/>
+                <w:rFonts w:ascii="Calibri" w:hAnsi="Calibri" w:eastAsia="Calibri" w:cs="Calibri"/>
                 <w:b w:val="0"/>
                 <w:i w:val="0"/>
                 <w:color w:val="000000"/>
@@ -2452,7 +2476,7 @@
             </w:pPr>
             <w:r>
               <w:rPr>
-                <w:rFonts w:ascii="Calibri" w:hAnsi="Calibri"/>
+                <w:rFonts w:ascii="Calibri" w:hAnsi="Calibri" w:eastAsia="Calibri" w:cs="Calibri"/>
                 <w:b/>
                 <w:i w:val="0"/>
                 <w:color w:val="2F75B5"/>
@@ -2491,7 +2515,7 @@
             </w:pPr>
             <w:r>
               <w:rPr>
-                <w:rFonts w:ascii="Calibri" w:hAnsi="Calibri"/>
+                <w:rFonts w:ascii="Calibri" w:hAnsi="Calibri" w:eastAsia="Calibri" w:cs="Calibri"/>
                 <w:b w:val="0"/>
                 <w:i w:val="0"/>
                 <w:color w:val="000000"/>
@@ -2530,7 +2554,7 @@
             </w:pPr>
             <w:r>
               <w:rPr>
-                <w:rFonts w:ascii="Calibri" w:hAnsi="Calibri"/>
+                <w:rFonts w:ascii="Calibri" w:hAnsi="Calibri" w:eastAsia="Calibri" w:cs="Calibri"/>
                 <w:b w:val="0"/>
                 <w:i w:val="0"/>
                 <w:color w:val="000000"/>
@@ -2581,7 +2605,7 @@
             </w:pPr>
             <w:r>
               <w:rPr>
-                <w:rFonts w:ascii="Calibri" w:hAnsi="Calibri"/>
+                <w:rFonts w:ascii="Calibri" w:hAnsi="Calibri" w:eastAsia="Calibri" w:cs="Calibri"/>
                 <w:b/>
                 <w:i w:val="0"/>
                 <w:color w:val="2F75B5"/>
@@ -2619,7 +2643,7 @@
             </w:pPr>
             <w:r>
               <w:rPr>
-                <w:rFonts w:ascii="Calibri" w:hAnsi="Calibri"/>
+                <w:rFonts w:ascii="Calibri" w:hAnsi="Calibri" w:eastAsia="Calibri" w:cs="Calibri"/>
                 <w:b w:val="0"/>
                 <w:i w:val="0"/>
                 <w:color w:val="000000"/>
@@ -2657,7 +2681,7 @@
             </w:pPr>
             <w:r>
               <w:rPr>
-                <w:rFonts w:ascii="Calibri" w:hAnsi="Calibri"/>
+                <w:rFonts w:ascii="Calibri" w:hAnsi="Calibri" w:eastAsia="Calibri" w:cs="Calibri"/>
                 <w:b w:val="0"/>
                 <w:i w:val="0"/>
                 <w:color w:val="000000"/>
@@ -2709,7 +2733,7 @@
             </w:pPr>
             <w:r>
               <w:rPr>
-                <w:rFonts w:ascii="Calibri" w:hAnsi="Calibri"/>
+                <w:rFonts w:ascii="Calibri" w:hAnsi="Calibri" w:eastAsia="Calibri" w:cs="Calibri"/>
                 <w:b/>
                 <w:i w:val="0"/>
                 <w:color w:val="2F75B5"/>
@@ -2748,7 +2772,7 @@
             </w:pPr>
             <w:r>
               <w:rPr>
-                <w:rFonts w:ascii="Calibri" w:hAnsi="Calibri"/>
+                <w:rFonts w:ascii="Calibri" w:hAnsi="Calibri" w:eastAsia="Calibri" w:cs="Calibri"/>
                 <w:b w:val="0"/>
                 <w:i w:val="0"/>
                 <w:color w:val="000000"/>
@@ -2787,7 +2811,7 @@
             </w:pPr>
             <w:r>
               <w:rPr>
-                <w:rFonts w:ascii="Calibri" w:hAnsi="Calibri"/>
+                <w:rFonts w:ascii="Calibri" w:hAnsi="Calibri" w:eastAsia="Calibri" w:cs="Calibri"/>
                 <w:b w:val="0"/>
                 <w:i w:val="0"/>
                 <w:color w:val="000000"/>
@@ -2817,6 +2841,9 @@
         <w:textAlignment w:val="auto"/>
       </w:pPr>
       <w:r>
+        <w:rPr>
+          <w:rFonts w:ascii="Calibri" w:hAnsi="Calibri" w:eastAsia="Calibri" w:cs="Calibri"/>
+        </w:rPr>
         <w:t>7. First-principles reflection</w:t>
       </w:r>
     </w:p>
@@ -2838,7 +2865,7 @@
       </w:pPr>
       <w:r>
         <w:rPr>
-          <w:rFonts w:ascii="Calibri" w:hAnsi="Calibri"/>
+          <w:rFonts w:ascii="Calibri" w:hAnsi="Calibri" w:eastAsia="Calibri" w:cs="Calibri"/>
           <w:b/>
           <w:i w:val="0"/>
           <w:color w:val="000000"/>
@@ -2848,7 +2875,7 @@
       </w:r>
       <w:r>
         <w:rPr>
-          <w:rFonts w:hint="eastAsia" w:eastAsia="宋体"/>
+          <w:rFonts w:eastAsia="Calibri" w:ascii="Calibri" w:hAnsi="Calibri" w:cs="Calibri"/>
           <w:b/>
           <w:i w:val="0"/>
           <w:color w:val="000000"/>
@@ -2861,7 +2888,7 @@
       <w:bookmarkEnd w:id="0"/>
       <w:r>
         <w:rPr>
-          <w:rFonts w:ascii="Calibri" w:hAnsi="Calibri"/>
+          <w:rFonts w:ascii="Calibri" w:hAnsi="Calibri" w:eastAsia="Calibri" w:cs="Calibri"/>
           <w:b/>
           <w:i w:val="0"/>
           <w:color w:val="000000"/>
@@ -2871,7 +2898,7 @@
       </w:r>
       <w:r>
         <w:rPr>
-          <w:rFonts w:ascii="Calibri" w:hAnsi="Calibri"/>
+          <w:rFonts w:ascii="Calibri" w:hAnsi="Calibri" w:eastAsia="Calibri" w:cs="Calibri"/>
           <w:b w:val="0"/>
           <w:i w:val="0"/>
           <w:color w:val="000000"/>
@@ -2881,7 +2908,7 @@
       </w:r>
       <w:r>
         <w:rPr>
-          <w:rFonts w:hint="eastAsia" w:eastAsia="宋体"/>
+          <w:rFonts w:eastAsia="Calibri" w:ascii="Calibri" w:hAnsi="Calibri" w:cs="Calibri"/>
           <w:b w:val="0"/>
           <w:i w:val="0"/>
           <w:color w:val="000000"/>
@@ -2892,7 +2919,7 @@
       </w:r>
       <w:r>
         <w:rPr>
-          <w:rFonts w:ascii="Calibri" w:hAnsi="Calibri"/>
+          <w:rFonts w:ascii="Calibri" w:hAnsi="Calibri" w:eastAsia="Calibri" w:cs="Calibri"/>
           <w:b w:val="0"/>
           <w:i w:val="0"/>
           <w:color w:val="000000"/>

</xml_diff>